<commit_message>
added notes on beta testing strategy
</commit_message>
<xml_diff>
--- a/documents/strategic_direction_and_roadmaps/10_business/21_roadmap_product_qc_beta_testing.docx
+++ b/documents/strategic_direction_and_roadmaps/10_business/21_roadmap_product_qc_beta_testing.docx
@@ -167,7 +167,47 @@
       </w:r>
       <w:r>
         <w:rPr/>
-        <w:t>beta 1 -- small closed beta for 2 weeks</w:t>
+        <w:t>create one beta page (accessed from the tool in Blender) on the website to gather bug report</w:t>
+      </w:r>
+    </w:p>
+    <w:p>
+      <w:pPr>
+        <w:pStyle w:val="Normal"/>
+        <w:spacing w:before="0" w:after="80"/>
+        <w:rPr/>
+      </w:pPr>
+      <w:r>
+        <w:rPr/>
+        <w:t xml:space="preserve">☐  </w:t>
+      </w:r>
+      <w:r>
+        <w:rPr/>
+        <w:t>beta 1 -- small closed beta with 5 people for 2 weeks</w:t>
+      </w:r>
+    </w:p>
+    <w:p>
+      <w:pPr>
+        <w:pStyle w:val="Normal"/>
+        <w:spacing w:before="0" w:after="80"/>
+        <w:rPr/>
+      </w:pPr>
+      <w:r>
+        <w:rPr/>
+        <w:t xml:space="preserve">☐  </w:t>
+      </w:r>
+      <w:r>
+        <w:rPr/>
+        <w:t xml:space="preserve">Have each of the 4 deliberately identify </w:t>
+      </w:r>
+      <w:r>
+        <w:rPr>
+          <w:rStyle w:val="Strong"/>
+        </w:rPr>
+        <w:t>2–5 other professionals</w:t>
+      </w:r>
+      <w:r>
+        <w:rPr/>
+        <w:t xml:space="preserve"> </w:t>
       </w:r>
     </w:p>
     <w:p>
@@ -233,21 +273,6 @@
       </w:r>
       <w:r>
         <w:rPr/>
-        <w:t>create one beta page (accessed from the tool in Blender) on the website to gather bug report</w:t>
-      </w:r>
-    </w:p>
-    <w:p>
-      <w:pPr>
-        <w:pStyle w:val="Normal"/>
-        <w:spacing w:before="0" w:after="80"/>
-        <w:rPr/>
-      </w:pPr>
-      <w:r>
-        <w:rPr/>
-        <w:t xml:space="preserve">☐  </w:t>
-      </w:r>
-      <w:r>
-        <w:rPr/>
         <w:t>fix reported bugs/problems</w:t>
       </w:r>
     </w:p>
@@ -361,13 +386,26 @@
     </w:p>
     <w:p>
       <w:pPr>
-        <w:pStyle w:val="Normal"/>
-        <w:spacing w:before="0" w:after="160"/>
-        <w:rPr/>
-      </w:pPr>
-      <w:r>
-        <w:rPr/>
-        <w:t>I think I would make a simple specific Privacy text directly on the beta bug reporting form page for that specific situation, because I think telling the user “we won’t share their Blender files” should not be included in the main website’s Privacy Policy</w:t>
+        <w:pStyle w:val="BodyText"/>
+        <w:rPr/>
+      </w:pPr>
+      <w:r>
+        <w:rPr/>
+        <w:t xml:space="preserve">I think we should already create the actual Public Beta Testing page, and simply direct our friends to that page. We should already have a signup mechanism (wich will become our first audience build-up). -- See 22_notes_on_beta_testing </w:t>
+      </w:r>
+      <w:r>
+        <w:rPr/>
+        <w:t>doc.</w:t>
+      </w:r>
+    </w:p>
+    <w:p>
+      <w:pPr>
+        <w:pStyle w:val="BodyText"/>
+        <w:spacing w:before="0" w:after="140"/>
+        <w:rPr/>
+      </w:pPr>
+      <w:r>
+        <w:rPr/>
       </w:r>
     </w:p>
     <w:sectPr>
@@ -558,6 +596,14 @@
     <w:rPr>
       <w:sz w:val="20"/>
       <w:szCs w:val="20"/>
+    </w:rPr>
+  </w:style>
+  <w:style w:type="character" w:styleId="Strong">
+    <w:name w:val="Strong"/>
+    <w:qFormat/>
+    <w:rPr>
+      <w:b/>
+      <w:bCs/>
     </w:rPr>
   </w:style>
   <w:style w:type="paragraph" w:styleId="Heading">

</xml_diff>